<commit_message>
Fixed registration for UBPX800
</commit_message>
<xml_diff>
--- a/docs/protocol.docx
+++ b/docs/protocol.docx
@@ -3,6 +3,105 @@
 <w:document xmlns:wpc="http://schemas.microsoft.com/office/word/2010/wordprocessingCanvas" xmlns:cx="http://schemas.microsoft.com/office/drawing/2014/chartex" xmlns:cx1="http://schemas.microsoft.com/office/drawing/2015/9/8/chartex" xmlns:cx2="http://schemas.microsoft.com/office/drawing/2015/10/21/chartex" xmlns:cx3="http://schemas.microsoft.com/office/drawing/2016/5/9/chartex" xmlns:cx4="http://schemas.microsoft.com/office/drawing/2016/5/10/chartex" xmlns:cx5="http://schemas.microsoft.com/office/drawing/2016/5/11/chartex" xmlns:cx6="http://schemas.microsoft.com/office/drawing/2016/5/12/chartex" xmlns:cx7="http://schemas.microsoft.com/office/drawing/2016/5/13/chartex" xmlns:cx8="http://schemas.microsoft.com/office/drawing/2016/5/14/chartex" xmlns:mc="http://schemas.openxmlformats.org/markup-compatibility/2006" xmlns:aink="http://schemas.microsoft.com/office/drawing/2016/ink" xmlns:am3d="http://schemas.microsoft.com/office/drawing/2017/model3d" xmlns:o="urn:schemas-microsoft-com:office:office" xmlns:oel="http://schemas.microsoft.com/office/2019/extlst" xmlns:r="http://schemas.openxmlformats.org/officeDocument/2006/relationships" xmlns:m="http://schemas.openxmlformats.org/officeDocument/2006/math" xmlns:v="urn:schemas-microsoft-com:vml" xmlns:wp14="http://schemas.microsoft.com/office/word/2010/wordprocessingDrawing" xmlns:wp="http://schemas.openxmlformats.org/drawingml/2006/wordprocessingDrawing" xmlns:w10="urn:schemas-microsoft-com:office:word" xmlns:w="http://schemas.openxmlformats.org/wordprocessingml/2006/main" xmlns:w14="http://schemas.microsoft.com/office/word/2010/wordml" xmlns:w15="http://schemas.microsoft.com/office/word/2012/wordml" xmlns:w16cex="http://schemas.microsoft.com/office/word/2018/wordml/cex" xmlns:w16cid="http://schemas.microsoft.com/office/word/2016/wordml/cid" xmlns:w16="http://schemas.microsoft.com/office/word/2018/wordml" xmlns:w16du="http://schemas.microsoft.com/office/word/2023/wordml/word16du" xmlns:w16sdtdh="http://schemas.microsoft.com/office/word/2020/wordml/sdtdatahash" xmlns:w16sdtfl="http://schemas.microsoft.com/office/word/2024/wordml/sdtformatlock" xmlns:w16se="http://schemas.microsoft.com/office/word/2015/wordml/symex" xmlns:wpg="http://schemas.microsoft.com/office/word/2010/wordprocessingGroup" xmlns:wpi="http://schemas.microsoft.com/office/word/2010/wordprocessingInk" xmlns:wne="http://schemas.microsoft.com/office/word/2006/wordml" xmlns:wps="http://schemas.microsoft.com/office/word/2010/wordprocessingShape" mc:Ignorable="w14 w15 w16se w16cid w16 w16cex w16sdtdh w16sdtfl w16du wp14">
   <w:body>
     <w:p>
+      <w:r>
+        <w:t xml:space="preserve">Registration : </w:t>
+      </w:r>
+    </w:p>
+    <w:p>
+      <w:r>
+        <w:t>On Linux/Mac :</w:t>
+      </w:r>
+    </w:p>
+    <w:p>
+      <w:pPr>
+        <w:pStyle w:val="messagelistitem5126c"/>
+        <w:spacing w:before="0" w:beforeAutospacing="0" w:after="0" w:afterAutospacing="0"/>
+        <w:textAlignment w:val="baseline"/>
+        <w:rPr>
+          <w:rStyle w:val="CodeHTML"/>
+          <w:rFonts w:ascii="var(--font-code)" w:eastAsiaTheme="majorEastAsia" w:hAnsi="var(--font-code)"/>
+        </w:rPr>
+      </w:pPr>
+      <w:proofErr w:type="spellStart"/>
+      <w:r>
+        <w:rPr>
+          <w:rStyle w:val="CodeHTML"/>
+          <w:rFonts w:ascii="var(--font-code)" w:eastAsiaTheme="majorEastAsia" w:hAnsi="var(--font-code)"/>
+        </w:rPr>
+        <w:t>curl</w:t>
+      </w:r>
+      <w:proofErr w:type="spellEnd"/>
+      <w:r>
+        <w:rPr>
+          <w:rStyle w:val="CodeHTML"/>
+          <w:rFonts w:ascii="var(--font-code)" w:eastAsiaTheme="majorEastAsia" w:hAnsi="var(--font-code)"/>
+        </w:rPr>
+        <w:t xml:space="preserve"> --location 'http://192.168.1.166:50002/register?registrationType=initial&amp;deviceId=Albator&amp;wolSupport=true&amp;name=Albator'</w:t>
+      </w:r>
+    </w:p>
+    <w:p>
+      <w:pPr>
+        <w:pStyle w:val="messagelistitem5126c"/>
+        <w:spacing w:before="0" w:beforeAutospacing="0" w:after="0" w:afterAutospacing="0"/>
+        <w:textAlignment w:val="baseline"/>
+        <w:rPr>
+          <w:rStyle w:val="CodeHTML"/>
+          <w:rFonts w:ascii="var(--font-code)" w:eastAsiaTheme="majorEastAsia" w:hAnsi="var(--font-code)"/>
+        </w:rPr>
+      </w:pPr>
+    </w:p>
+    <w:p>
+      <w:pPr>
+        <w:pStyle w:val="messagelistitem5126c"/>
+        <w:spacing w:before="0" w:beforeAutospacing="0" w:after="0" w:afterAutospacing="0"/>
+        <w:textAlignment w:val="baseline"/>
+        <w:rPr>
+          <w:rFonts w:ascii="inherit" w:hAnsi="inherit" w:cs="Noto Sans"/>
+        </w:rPr>
+      </w:pPr>
+      <w:r>
+        <w:rPr>
+          <w:rFonts w:ascii="inherit" w:hAnsi="inherit" w:cs="Noto Sans"/>
+          <w:bdr w:val="none" w:sz="0" w:space="0" w:color="auto" w:frame="1"/>
+        </w:rPr>
+        <w:t xml:space="preserve">On </w:t>
+      </w:r>
+      <w:proofErr w:type="spellStart"/>
+      <w:r>
+        <w:rPr>
+          <w:rFonts w:ascii="inherit" w:hAnsi="inherit" w:cs="Noto Sans"/>
+          <w:bdr w:val="none" w:sz="0" w:space="0" w:color="auto" w:frame="1"/>
+        </w:rPr>
+        <w:t>windows</w:t>
+      </w:r>
+      <w:proofErr w:type="spellEnd"/>
+      <w:r>
+        <w:rPr>
+          <w:rFonts w:ascii="inherit" w:hAnsi="inherit" w:cs="Noto Sans"/>
+          <w:bdr w:val="none" w:sz="0" w:space="0" w:color="auto" w:frame="1"/>
+        </w:rPr>
+        <w:t xml:space="preserve"> : </w:t>
+      </w:r>
+      <w:proofErr w:type="spellStart"/>
+      <w:r>
+        <w:rPr>
+          <w:rStyle w:val="CodeHTML"/>
+          <w:rFonts w:ascii="var(--font-code)" w:eastAsiaTheme="majorEastAsia" w:hAnsi="var(--font-code)"/>
+        </w:rPr>
+        <w:t>curl</w:t>
+      </w:r>
+      <w:proofErr w:type="spellEnd"/>
+      <w:r>
+        <w:rPr>
+          <w:rStyle w:val="CodeHTML"/>
+          <w:rFonts w:ascii="var(--font-code)" w:eastAsiaTheme="majorEastAsia" w:hAnsi="var(--font-code)"/>
+        </w:rPr>
+        <w:t xml:space="preserve"> "http://192.168.1.117:50002/register?registrationType=initial&amp;deviceId=Albator&amp;wolSupport=true&amp;name=Albator"</w:t>
+      </w:r>
+    </w:p>
+    <w:p/>
+    <w:p/>
+    <w:p>
       <w:proofErr w:type="spellStart"/>
       <w:proofErr w:type="gramStart"/>
       <w:r>
@@ -13,7 +112,7 @@
       <w:r>
         <w:t xml:space="preserve"> </w:t>
       </w:r>
-      <w:hyperlink r:id="rId4" w:history="1">
+      <w:hyperlink r:id="rId5" w:history="1">
         <w:r>
           <w:rPr>
             <w:rStyle w:val="Lienhypertexte"/>
@@ -3510,896 +3609,6 @@
           <w:sz w:val="22"/>
           <w:szCs w:val="22"/>
         </w:rPr>
-        <w:t xml:space="preserve">        &lt;</w:t>
-      </w:r>
-      <w:proofErr w:type="spellStart"/>
-      <w:proofErr w:type="gramStart"/>
-      <w:r>
-        <w:rPr>
-          <w:rFonts w:ascii="Menlo" w:hAnsi="Menlo" w:cs="Menlo"/>
-          <w:color w:val="000000"/>
-          <w:kern w:val="0"/>
-          <w:sz w:val="22"/>
-          <w:szCs w:val="22"/>
-        </w:rPr>
-        <w:t>depth</w:t>
-      </w:r>
-      <w:proofErr w:type="spellEnd"/>
-      <w:proofErr w:type="gramEnd"/>
-      <w:r>
-        <w:rPr>
-          <w:rFonts w:ascii="Menlo" w:hAnsi="Menlo" w:cs="Menlo"/>
-          <w:color w:val="000000"/>
-          <w:kern w:val="0"/>
-          <w:sz w:val="22"/>
-          <w:szCs w:val="22"/>
-        </w:rPr>
-        <w:t>&gt;24&lt;/</w:t>
-      </w:r>
-      <w:proofErr w:type="spellStart"/>
-      <w:r>
-        <w:rPr>
-          <w:rFonts w:ascii="Menlo" w:hAnsi="Menlo" w:cs="Menlo"/>
-          <w:color w:val="000000"/>
-          <w:kern w:val="0"/>
-          <w:sz w:val="22"/>
-          <w:szCs w:val="22"/>
-        </w:rPr>
-        <w:t>depth</w:t>
-      </w:r>
-      <w:proofErr w:type="spellEnd"/>
-      <w:r>
-        <w:rPr>
-          <w:rFonts w:ascii="Menlo" w:hAnsi="Menlo" w:cs="Menlo"/>
-          <w:color w:val="000000"/>
-          <w:kern w:val="0"/>
-          <w:sz w:val="22"/>
-          <w:szCs w:val="22"/>
-        </w:rPr>
-        <w:t>&gt;</w:t>
-      </w:r>
-    </w:p>
-    <w:p>
-      <w:pPr>
-        <w:pBdr>
-          <w:top w:val="single" w:sz="4" w:space="1" w:color="auto" w:shadow="1"/>
-          <w:left w:val="single" w:sz="4" w:space="4" w:color="auto" w:shadow="1"/>
-          <w:bottom w:val="single" w:sz="4" w:space="1" w:color="auto" w:shadow="1"/>
-          <w:right w:val="single" w:sz="4" w:space="4" w:color="auto" w:shadow="1"/>
-        </w:pBdr>
-        <w:shd w:val="pct20" w:color="auto" w:fill="auto"/>
-        <w:tabs>
-          <w:tab w:val="left" w:pos="560"/>
-          <w:tab w:val="left" w:pos="1120"/>
-          <w:tab w:val="left" w:pos="1680"/>
-          <w:tab w:val="left" w:pos="2240"/>
-          <w:tab w:val="left" w:pos="2800"/>
-          <w:tab w:val="left" w:pos="3360"/>
-          <w:tab w:val="left" w:pos="3920"/>
-          <w:tab w:val="left" w:pos="4480"/>
-          <w:tab w:val="left" w:pos="5040"/>
-          <w:tab w:val="left" w:pos="5600"/>
-          <w:tab w:val="left" w:pos="6160"/>
-          <w:tab w:val="left" w:pos="6720"/>
-        </w:tabs>
-        <w:autoSpaceDE w:val="0"/>
-        <w:autoSpaceDN w:val="0"/>
-        <w:adjustRightInd w:val="0"/>
-        <w:rPr>
-          <w:rFonts w:ascii="Menlo" w:hAnsi="Menlo" w:cs="Menlo"/>
-          <w:color w:val="000000"/>
-          <w:kern w:val="0"/>
-          <w:sz w:val="22"/>
-          <w:szCs w:val="22"/>
-        </w:rPr>
-      </w:pPr>
-      <w:r>
-        <w:rPr>
-          <w:rFonts w:ascii="Menlo" w:hAnsi="Menlo" w:cs="Menlo"/>
-          <w:color w:val="000000"/>
-          <w:kern w:val="0"/>
-          <w:sz w:val="22"/>
-          <w:szCs w:val="22"/>
-        </w:rPr>
-        <w:t xml:space="preserve">        &lt;</w:t>
-      </w:r>
-      <w:proofErr w:type="gramStart"/>
-      <w:r>
-        <w:rPr>
-          <w:rFonts w:ascii="Menlo" w:hAnsi="Menlo" w:cs="Menlo"/>
-          <w:color w:val="000000"/>
-          <w:kern w:val="0"/>
-          <w:sz w:val="22"/>
-          <w:szCs w:val="22"/>
-        </w:rPr>
-        <w:t>url</w:t>
-      </w:r>
-      <w:proofErr w:type="gramEnd"/>
-      <w:r>
-        <w:rPr>
-          <w:rFonts w:ascii="Menlo" w:hAnsi="Menlo" w:cs="Menlo"/>
-          <w:color w:val="000000"/>
-          <w:kern w:val="0"/>
-          <w:sz w:val="22"/>
-          <w:szCs w:val="22"/>
-        </w:rPr>
-        <w:t>&gt;/bdp_ce_device_icon_small.png&lt;/url&gt;</w:t>
-      </w:r>
-    </w:p>
-    <w:p>
-      <w:pPr>
-        <w:pBdr>
-          <w:top w:val="single" w:sz="4" w:space="1" w:color="auto" w:shadow="1"/>
-          <w:left w:val="single" w:sz="4" w:space="4" w:color="auto" w:shadow="1"/>
-          <w:bottom w:val="single" w:sz="4" w:space="1" w:color="auto" w:shadow="1"/>
-          <w:right w:val="single" w:sz="4" w:space="4" w:color="auto" w:shadow="1"/>
-        </w:pBdr>
-        <w:shd w:val="pct20" w:color="auto" w:fill="auto"/>
-        <w:tabs>
-          <w:tab w:val="left" w:pos="560"/>
-          <w:tab w:val="left" w:pos="1120"/>
-          <w:tab w:val="left" w:pos="1680"/>
-          <w:tab w:val="left" w:pos="2240"/>
-          <w:tab w:val="left" w:pos="2800"/>
-          <w:tab w:val="left" w:pos="3360"/>
-          <w:tab w:val="left" w:pos="3920"/>
-          <w:tab w:val="left" w:pos="4480"/>
-          <w:tab w:val="left" w:pos="5040"/>
-          <w:tab w:val="left" w:pos="5600"/>
-          <w:tab w:val="left" w:pos="6160"/>
-          <w:tab w:val="left" w:pos="6720"/>
-        </w:tabs>
-        <w:autoSpaceDE w:val="0"/>
-        <w:autoSpaceDN w:val="0"/>
-        <w:adjustRightInd w:val="0"/>
-        <w:rPr>
-          <w:rFonts w:ascii="Menlo" w:hAnsi="Menlo" w:cs="Menlo"/>
-          <w:color w:val="000000"/>
-          <w:kern w:val="0"/>
-          <w:sz w:val="22"/>
-          <w:szCs w:val="22"/>
-        </w:rPr>
-      </w:pPr>
-      <w:r>
-        <w:rPr>
-          <w:rFonts w:ascii="Menlo" w:hAnsi="Menlo" w:cs="Menlo"/>
-          <w:color w:val="000000"/>
-          <w:kern w:val="0"/>
-          <w:sz w:val="22"/>
-          <w:szCs w:val="22"/>
-        </w:rPr>
-        <w:t xml:space="preserve">      &lt;/</w:t>
-      </w:r>
-      <w:proofErr w:type="spellStart"/>
-      <w:r>
-        <w:rPr>
-          <w:rFonts w:ascii="Menlo" w:hAnsi="Menlo" w:cs="Menlo"/>
-          <w:color w:val="000000"/>
-          <w:kern w:val="0"/>
-          <w:sz w:val="22"/>
-          <w:szCs w:val="22"/>
-        </w:rPr>
-        <w:t>icon</w:t>
-      </w:r>
-      <w:proofErr w:type="spellEnd"/>
-      <w:r>
-        <w:rPr>
-          <w:rFonts w:ascii="Menlo" w:hAnsi="Menlo" w:cs="Menlo"/>
-          <w:color w:val="000000"/>
-          <w:kern w:val="0"/>
-          <w:sz w:val="22"/>
-          <w:szCs w:val="22"/>
-        </w:rPr>
-        <w:t>&gt;</w:t>
-      </w:r>
-    </w:p>
-    <w:p>
-      <w:pPr>
-        <w:pBdr>
-          <w:top w:val="single" w:sz="4" w:space="1" w:color="auto" w:shadow="1"/>
-          <w:left w:val="single" w:sz="4" w:space="4" w:color="auto" w:shadow="1"/>
-          <w:bottom w:val="single" w:sz="4" w:space="1" w:color="auto" w:shadow="1"/>
-          <w:right w:val="single" w:sz="4" w:space="4" w:color="auto" w:shadow="1"/>
-        </w:pBdr>
-        <w:shd w:val="pct20" w:color="auto" w:fill="auto"/>
-        <w:tabs>
-          <w:tab w:val="left" w:pos="560"/>
-          <w:tab w:val="left" w:pos="1120"/>
-          <w:tab w:val="left" w:pos="1680"/>
-          <w:tab w:val="left" w:pos="2240"/>
-          <w:tab w:val="left" w:pos="2800"/>
-          <w:tab w:val="left" w:pos="3360"/>
-          <w:tab w:val="left" w:pos="3920"/>
-          <w:tab w:val="left" w:pos="4480"/>
-          <w:tab w:val="left" w:pos="5040"/>
-          <w:tab w:val="left" w:pos="5600"/>
-          <w:tab w:val="left" w:pos="6160"/>
-          <w:tab w:val="left" w:pos="6720"/>
-        </w:tabs>
-        <w:autoSpaceDE w:val="0"/>
-        <w:autoSpaceDN w:val="0"/>
-        <w:adjustRightInd w:val="0"/>
-        <w:rPr>
-          <w:rFonts w:ascii="Menlo" w:hAnsi="Menlo" w:cs="Menlo"/>
-          <w:color w:val="000000"/>
-          <w:kern w:val="0"/>
-          <w:sz w:val="22"/>
-          <w:szCs w:val="22"/>
-        </w:rPr>
-      </w:pPr>
-      <w:r>
-        <w:rPr>
-          <w:rFonts w:ascii="Menlo" w:hAnsi="Menlo" w:cs="Menlo"/>
-          <w:color w:val="000000"/>
-          <w:kern w:val="0"/>
-          <w:sz w:val="22"/>
-          <w:szCs w:val="22"/>
-        </w:rPr>
-        <w:t xml:space="preserve">    &lt;/</w:t>
-      </w:r>
-      <w:proofErr w:type="spellStart"/>
-      <w:r>
-        <w:rPr>
-          <w:rFonts w:ascii="Menlo" w:hAnsi="Menlo" w:cs="Menlo"/>
-          <w:color w:val="000000"/>
-          <w:kern w:val="0"/>
-          <w:sz w:val="22"/>
-          <w:szCs w:val="22"/>
-        </w:rPr>
-        <w:t>iconList</w:t>
-      </w:r>
-      <w:proofErr w:type="spellEnd"/>
-      <w:r>
-        <w:rPr>
-          <w:rFonts w:ascii="Menlo" w:hAnsi="Menlo" w:cs="Menlo"/>
-          <w:color w:val="000000"/>
-          <w:kern w:val="0"/>
-          <w:sz w:val="22"/>
-          <w:szCs w:val="22"/>
-        </w:rPr>
-        <w:t>&gt;</w:t>
-      </w:r>
-    </w:p>
-    <w:p>
-      <w:pPr>
-        <w:pBdr>
-          <w:top w:val="single" w:sz="4" w:space="1" w:color="auto" w:shadow="1"/>
-          <w:left w:val="single" w:sz="4" w:space="4" w:color="auto" w:shadow="1"/>
-          <w:bottom w:val="single" w:sz="4" w:space="1" w:color="auto" w:shadow="1"/>
-          <w:right w:val="single" w:sz="4" w:space="4" w:color="auto" w:shadow="1"/>
-        </w:pBdr>
-        <w:shd w:val="pct20" w:color="auto" w:fill="auto"/>
-        <w:tabs>
-          <w:tab w:val="left" w:pos="560"/>
-          <w:tab w:val="left" w:pos="1120"/>
-          <w:tab w:val="left" w:pos="1680"/>
-          <w:tab w:val="left" w:pos="2240"/>
-          <w:tab w:val="left" w:pos="2800"/>
-          <w:tab w:val="left" w:pos="3360"/>
-          <w:tab w:val="left" w:pos="3920"/>
-          <w:tab w:val="left" w:pos="4480"/>
-          <w:tab w:val="left" w:pos="5040"/>
-          <w:tab w:val="left" w:pos="5600"/>
-          <w:tab w:val="left" w:pos="6160"/>
-          <w:tab w:val="left" w:pos="6720"/>
-        </w:tabs>
-        <w:autoSpaceDE w:val="0"/>
-        <w:autoSpaceDN w:val="0"/>
-        <w:adjustRightInd w:val="0"/>
-        <w:rPr>
-          <w:rFonts w:ascii="Menlo" w:hAnsi="Menlo" w:cs="Menlo"/>
-          <w:color w:val="000000"/>
-          <w:kern w:val="0"/>
-          <w:sz w:val="22"/>
-          <w:szCs w:val="22"/>
-        </w:rPr>
-      </w:pPr>
-      <w:r>
-        <w:rPr>
-          <w:rFonts w:ascii="Menlo" w:hAnsi="Menlo" w:cs="Menlo"/>
-          <w:color w:val="000000"/>
-          <w:kern w:val="0"/>
-          <w:sz w:val="22"/>
-          <w:szCs w:val="22"/>
-        </w:rPr>
-        <w:t xml:space="preserve">    &lt;</w:t>
-      </w:r>
-      <w:proofErr w:type="spellStart"/>
-      <w:proofErr w:type="gramStart"/>
-      <w:r>
-        <w:rPr>
-          <w:rFonts w:ascii="Menlo" w:hAnsi="Menlo" w:cs="Menlo"/>
-          <w:color w:val="000000"/>
-          <w:kern w:val="0"/>
-          <w:sz w:val="22"/>
-          <w:szCs w:val="22"/>
-        </w:rPr>
-        <w:t>serviceList</w:t>
-      </w:r>
-      <w:proofErr w:type="spellEnd"/>
-      <w:proofErr w:type="gramEnd"/>
-      <w:r>
-        <w:rPr>
-          <w:rFonts w:ascii="Menlo" w:hAnsi="Menlo" w:cs="Menlo"/>
-          <w:color w:val="000000"/>
-          <w:kern w:val="0"/>
-          <w:sz w:val="22"/>
-          <w:szCs w:val="22"/>
-        </w:rPr>
-        <w:t>&gt;</w:t>
-      </w:r>
-    </w:p>
-    <w:p>
-      <w:pPr>
-        <w:pBdr>
-          <w:top w:val="single" w:sz="4" w:space="1" w:color="auto" w:shadow="1"/>
-          <w:left w:val="single" w:sz="4" w:space="4" w:color="auto" w:shadow="1"/>
-          <w:bottom w:val="single" w:sz="4" w:space="1" w:color="auto" w:shadow="1"/>
-          <w:right w:val="single" w:sz="4" w:space="4" w:color="auto" w:shadow="1"/>
-        </w:pBdr>
-        <w:shd w:val="pct20" w:color="auto" w:fill="auto"/>
-        <w:tabs>
-          <w:tab w:val="left" w:pos="560"/>
-          <w:tab w:val="left" w:pos="1120"/>
-          <w:tab w:val="left" w:pos="1680"/>
-          <w:tab w:val="left" w:pos="2240"/>
-          <w:tab w:val="left" w:pos="2800"/>
-          <w:tab w:val="left" w:pos="3360"/>
-          <w:tab w:val="left" w:pos="3920"/>
-          <w:tab w:val="left" w:pos="4480"/>
-          <w:tab w:val="left" w:pos="5040"/>
-          <w:tab w:val="left" w:pos="5600"/>
-          <w:tab w:val="left" w:pos="6160"/>
-          <w:tab w:val="left" w:pos="6720"/>
-        </w:tabs>
-        <w:autoSpaceDE w:val="0"/>
-        <w:autoSpaceDN w:val="0"/>
-        <w:adjustRightInd w:val="0"/>
-        <w:rPr>
-          <w:rFonts w:ascii="Menlo" w:hAnsi="Menlo" w:cs="Menlo"/>
-          <w:color w:val="000000"/>
-          <w:kern w:val="0"/>
-          <w:sz w:val="22"/>
-          <w:szCs w:val="22"/>
-        </w:rPr>
-      </w:pPr>
-      <w:r>
-        <w:rPr>
-          <w:rFonts w:ascii="Menlo" w:hAnsi="Menlo" w:cs="Menlo"/>
-          <w:color w:val="000000"/>
-          <w:kern w:val="0"/>
-          <w:sz w:val="22"/>
-          <w:szCs w:val="22"/>
-        </w:rPr>
-        <w:t xml:space="preserve">      &lt;</w:t>
-      </w:r>
-      <w:proofErr w:type="gramStart"/>
-      <w:r>
-        <w:rPr>
-          <w:rFonts w:ascii="Menlo" w:hAnsi="Menlo" w:cs="Menlo"/>
-          <w:color w:val="000000"/>
-          <w:kern w:val="0"/>
-          <w:sz w:val="22"/>
-          <w:szCs w:val="22"/>
-        </w:rPr>
-        <w:t>service</w:t>
-      </w:r>
-      <w:proofErr w:type="gramEnd"/>
-      <w:r>
-        <w:rPr>
-          <w:rFonts w:ascii="Menlo" w:hAnsi="Menlo" w:cs="Menlo"/>
-          <w:color w:val="000000"/>
-          <w:kern w:val="0"/>
-          <w:sz w:val="22"/>
-          <w:szCs w:val="22"/>
-        </w:rPr>
-        <w:t>&gt;</w:t>
-      </w:r>
-    </w:p>
-    <w:p>
-      <w:pPr>
-        <w:pBdr>
-          <w:top w:val="single" w:sz="4" w:space="1" w:color="auto" w:shadow="1"/>
-          <w:left w:val="single" w:sz="4" w:space="4" w:color="auto" w:shadow="1"/>
-          <w:bottom w:val="single" w:sz="4" w:space="1" w:color="auto" w:shadow="1"/>
-          <w:right w:val="single" w:sz="4" w:space="4" w:color="auto" w:shadow="1"/>
-        </w:pBdr>
-        <w:shd w:val="pct20" w:color="auto" w:fill="auto"/>
-        <w:tabs>
-          <w:tab w:val="left" w:pos="560"/>
-          <w:tab w:val="left" w:pos="1120"/>
-          <w:tab w:val="left" w:pos="1680"/>
-          <w:tab w:val="left" w:pos="2240"/>
-          <w:tab w:val="left" w:pos="2800"/>
-          <w:tab w:val="left" w:pos="3360"/>
-          <w:tab w:val="left" w:pos="3920"/>
-          <w:tab w:val="left" w:pos="4480"/>
-          <w:tab w:val="left" w:pos="5040"/>
-          <w:tab w:val="left" w:pos="5600"/>
-          <w:tab w:val="left" w:pos="6160"/>
-          <w:tab w:val="left" w:pos="6720"/>
-        </w:tabs>
-        <w:autoSpaceDE w:val="0"/>
-        <w:autoSpaceDN w:val="0"/>
-        <w:adjustRightInd w:val="0"/>
-        <w:rPr>
-          <w:rFonts w:ascii="Menlo" w:hAnsi="Menlo" w:cs="Menlo"/>
-          <w:color w:val="000000"/>
-          <w:kern w:val="0"/>
-          <w:sz w:val="22"/>
-          <w:szCs w:val="22"/>
-        </w:rPr>
-      </w:pPr>
-      <w:r>
-        <w:rPr>
-          <w:rFonts w:ascii="Menlo" w:hAnsi="Menlo" w:cs="Menlo"/>
-          <w:color w:val="000000"/>
-          <w:kern w:val="0"/>
-          <w:sz w:val="22"/>
-          <w:szCs w:val="22"/>
-        </w:rPr>
-        <w:t xml:space="preserve">        &lt;</w:t>
-      </w:r>
-      <w:proofErr w:type="spellStart"/>
-      <w:proofErr w:type="gramStart"/>
-      <w:r>
-        <w:rPr>
-          <w:rFonts w:ascii="Menlo" w:hAnsi="Menlo" w:cs="Menlo"/>
-          <w:color w:val="000000"/>
-          <w:kern w:val="0"/>
-          <w:sz w:val="22"/>
-          <w:szCs w:val="22"/>
-        </w:rPr>
-        <w:t>serviceType</w:t>
-      </w:r>
-      <w:proofErr w:type="spellEnd"/>
-      <w:proofErr w:type="gramEnd"/>
-      <w:r>
-        <w:rPr>
-          <w:rFonts w:ascii="Menlo" w:hAnsi="Menlo" w:cs="Menlo"/>
-          <w:color w:val="000000"/>
-          <w:kern w:val="0"/>
-          <w:sz w:val="22"/>
-          <w:szCs w:val="22"/>
-        </w:rPr>
-        <w:t>&gt;</w:t>
-      </w:r>
-      <w:proofErr w:type="gramStart"/>
-      <w:r>
-        <w:rPr>
-          <w:rFonts w:ascii="Menlo" w:hAnsi="Menlo" w:cs="Menlo"/>
-          <w:color w:val="000000"/>
-          <w:kern w:val="0"/>
-          <w:sz w:val="22"/>
-          <w:szCs w:val="22"/>
-        </w:rPr>
-        <w:t>urn:schemas</w:t>
-      </w:r>
-      <w:proofErr w:type="gramEnd"/>
-      <w:r>
-        <w:rPr>
-          <w:rFonts w:ascii="Menlo" w:hAnsi="Menlo" w:cs="Menlo"/>
-          <w:color w:val="000000"/>
-          <w:kern w:val="0"/>
-          <w:sz w:val="22"/>
-          <w:szCs w:val="22"/>
-        </w:rPr>
-        <w:t>-sony-</w:t>
-      </w:r>
-      <w:proofErr w:type="gramStart"/>
-      <w:r>
-        <w:rPr>
-          <w:rFonts w:ascii="Menlo" w:hAnsi="Menlo" w:cs="Menlo"/>
-          <w:color w:val="000000"/>
-          <w:kern w:val="0"/>
-          <w:sz w:val="22"/>
-          <w:szCs w:val="22"/>
-        </w:rPr>
-        <w:t>com:service</w:t>
-      </w:r>
-      <w:proofErr w:type="gramEnd"/>
-      <w:r>
-        <w:rPr>
-          <w:rFonts w:ascii="Menlo" w:hAnsi="Menlo" w:cs="Menlo"/>
-          <w:color w:val="000000"/>
-          <w:kern w:val="0"/>
-          <w:sz w:val="22"/>
-          <w:szCs w:val="22"/>
-        </w:rPr>
-        <w:t>:</w:t>
-      </w:r>
-      <w:proofErr w:type="gramStart"/>
-      <w:r>
-        <w:rPr>
-          <w:rFonts w:ascii="Menlo" w:hAnsi="Menlo" w:cs="Menlo"/>
-          <w:color w:val="000000"/>
-          <w:kern w:val="0"/>
-          <w:sz w:val="22"/>
-          <w:szCs w:val="22"/>
-        </w:rPr>
-        <w:t>IRCC:</w:t>
-      </w:r>
-      <w:proofErr w:type="gramEnd"/>
-      <w:r>
-        <w:rPr>
-          <w:rFonts w:ascii="Menlo" w:hAnsi="Menlo" w:cs="Menlo"/>
-          <w:color w:val="000000"/>
-          <w:kern w:val="0"/>
-          <w:sz w:val="22"/>
-          <w:szCs w:val="22"/>
-        </w:rPr>
-        <w:t>1&lt;/</w:t>
-      </w:r>
-      <w:proofErr w:type="spellStart"/>
-      <w:r>
-        <w:rPr>
-          <w:rFonts w:ascii="Menlo" w:hAnsi="Menlo" w:cs="Menlo"/>
-          <w:color w:val="000000"/>
-          <w:kern w:val="0"/>
-          <w:sz w:val="22"/>
-          <w:szCs w:val="22"/>
-        </w:rPr>
-        <w:t>serviceType</w:t>
-      </w:r>
-      <w:proofErr w:type="spellEnd"/>
-      <w:r>
-        <w:rPr>
-          <w:rFonts w:ascii="Menlo" w:hAnsi="Menlo" w:cs="Menlo"/>
-          <w:color w:val="000000"/>
-          <w:kern w:val="0"/>
-          <w:sz w:val="22"/>
-          <w:szCs w:val="22"/>
-        </w:rPr>
-        <w:t>&gt;</w:t>
-      </w:r>
-    </w:p>
-    <w:p>
-      <w:pPr>
-        <w:pBdr>
-          <w:top w:val="single" w:sz="4" w:space="1" w:color="auto" w:shadow="1"/>
-          <w:left w:val="single" w:sz="4" w:space="4" w:color="auto" w:shadow="1"/>
-          <w:bottom w:val="single" w:sz="4" w:space="1" w:color="auto" w:shadow="1"/>
-          <w:right w:val="single" w:sz="4" w:space="4" w:color="auto" w:shadow="1"/>
-        </w:pBdr>
-        <w:shd w:val="pct20" w:color="auto" w:fill="auto"/>
-        <w:tabs>
-          <w:tab w:val="left" w:pos="560"/>
-          <w:tab w:val="left" w:pos="1120"/>
-          <w:tab w:val="left" w:pos="1680"/>
-          <w:tab w:val="left" w:pos="2240"/>
-          <w:tab w:val="left" w:pos="2800"/>
-          <w:tab w:val="left" w:pos="3360"/>
-          <w:tab w:val="left" w:pos="3920"/>
-          <w:tab w:val="left" w:pos="4480"/>
-          <w:tab w:val="left" w:pos="5040"/>
-          <w:tab w:val="left" w:pos="5600"/>
-          <w:tab w:val="left" w:pos="6160"/>
-          <w:tab w:val="left" w:pos="6720"/>
-        </w:tabs>
-        <w:autoSpaceDE w:val="0"/>
-        <w:autoSpaceDN w:val="0"/>
-        <w:adjustRightInd w:val="0"/>
-        <w:rPr>
-          <w:rFonts w:ascii="Menlo" w:hAnsi="Menlo" w:cs="Menlo"/>
-          <w:color w:val="000000"/>
-          <w:kern w:val="0"/>
-          <w:sz w:val="22"/>
-          <w:szCs w:val="22"/>
-        </w:rPr>
-      </w:pPr>
-      <w:r>
-        <w:rPr>
-          <w:rFonts w:ascii="Menlo" w:hAnsi="Menlo" w:cs="Menlo"/>
-          <w:color w:val="000000"/>
-          <w:kern w:val="0"/>
-          <w:sz w:val="22"/>
-          <w:szCs w:val="22"/>
-        </w:rPr>
-        <w:t xml:space="preserve">        &lt;</w:t>
-      </w:r>
-      <w:proofErr w:type="spellStart"/>
-      <w:proofErr w:type="gramStart"/>
-      <w:r>
-        <w:rPr>
-          <w:rFonts w:ascii="Menlo" w:hAnsi="Menlo" w:cs="Menlo"/>
-          <w:color w:val="000000"/>
-          <w:kern w:val="0"/>
-          <w:sz w:val="22"/>
-          <w:szCs w:val="22"/>
-        </w:rPr>
-        <w:t>serviceId</w:t>
-      </w:r>
-      <w:proofErr w:type="spellEnd"/>
-      <w:proofErr w:type="gramEnd"/>
-      <w:r>
-        <w:rPr>
-          <w:rFonts w:ascii="Menlo" w:hAnsi="Menlo" w:cs="Menlo"/>
-          <w:color w:val="000000"/>
-          <w:kern w:val="0"/>
-          <w:sz w:val="22"/>
-          <w:szCs w:val="22"/>
-        </w:rPr>
-        <w:t>&gt;</w:t>
-      </w:r>
-      <w:proofErr w:type="spellStart"/>
-      <w:proofErr w:type="gramStart"/>
-      <w:r>
-        <w:rPr>
-          <w:rFonts w:ascii="Menlo" w:hAnsi="Menlo" w:cs="Menlo"/>
-          <w:color w:val="000000"/>
-          <w:kern w:val="0"/>
-          <w:sz w:val="22"/>
-          <w:szCs w:val="22"/>
-        </w:rPr>
-        <w:t>urn:schemas</w:t>
-      </w:r>
-      <w:proofErr w:type="gramEnd"/>
-      <w:r>
-        <w:rPr>
-          <w:rFonts w:ascii="Menlo" w:hAnsi="Menlo" w:cs="Menlo"/>
-          <w:color w:val="000000"/>
-          <w:kern w:val="0"/>
-          <w:sz w:val="22"/>
-          <w:szCs w:val="22"/>
-        </w:rPr>
-        <w:t>-sony-</w:t>
-      </w:r>
-      <w:proofErr w:type="gramStart"/>
-      <w:r>
-        <w:rPr>
-          <w:rFonts w:ascii="Menlo" w:hAnsi="Menlo" w:cs="Menlo"/>
-          <w:color w:val="000000"/>
-          <w:kern w:val="0"/>
-          <w:sz w:val="22"/>
-          <w:szCs w:val="22"/>
-        </w:rPr>
-        <w:t>com:serviceId</w:t>
-      </w:r>
-      <w:proofErr w:type="gramEnd"/>
-      <w:r>
-        <w:rPr>
-          <w:rFonts w:ascii="Menlo" w:hAnsi="Menlo" w:cs="Menlo"/>
-          <w:color w:val="000000"/>
-          <w:kern w:val="0"/>
-          <w:sz w:val="22"/>
-          <w:szCs w:val="22"/>
-        </w:rPr>
-        <w:t>:IRCC</w:t>
-      </w:r>
-      <w:proofErr w:type="spellEnd"/>
-      <w:r>
-        <w:rPr>
-          <w:rFonts w:ascii="Menlo" w:hAnsi="Menlo" w:cs="Menlo"/>
-          <w:color w:val="000000"/>
-          <w:kern w:val="0"/>
-          <w:sz w:val="22"/>
-          <w:szCs w:val="22"/>
-        </w:rPr>
-        <w:t>&lt;/</w:t>
-      </w:r>
-      <w:proofErr w:type="spellStart"/>
-      <w:r>
-        <w:rPr>
-          <w:rFonts w:ascii="Menlo" w:hAnsi="Menlo" w:cs="Menlo"/>
-          <w:color w:val="000000"/>
-          <w:kern w:val="0"/>
-          <w:sz w:val="22"/>
-          <w:szCs w:val="22"/>
-        </w:rPr>
-        <w:t>serviceId</w:t>
-      </w:r>
-      <w:proofErr w:type="spellEnd"/>
-      <w:r>
-        <w:rPr>
-          <w:rFonts w:ascii="Menlo" w:hAnsi="Menlo" w:cs="Menlo"/>
-          <w:color w:val="000000"/>
-          <w:kern w:val="0"/>
-          <w:sz w:val="22"/>
-          <w:szCs w:val="22"/>
-        </w:rPr>
-        <w:t>&gt;</w:t>
-      </w:r>
-    </w:p>
-    <w:p>
-      <w:pPr>
-        <w:pBdr>
-          <w:top w:val="single" w:sz="4" w:space="1" w:color="auto" w:shadow="1"/>
-          <w:left w:val="single" w:sz="4" w:space="4" w:color="auto" w:shadow="1"/>
-          <w:bottom w:val="single" w:sz="4" w:space="1" w:color="auto" w:shadow="1"/>
-          <w:right w:val="single" w:sz="4" w:space="4" w:color="auto" w:shadow="1"/>
-        </w:pBdr>
-        <w:shd w:val="pct20" w:color="auto" w:fill="auto"/>
-        <w:tabs>
-          <w:tab w:val="left" w:pos="560"/>
-          <w:tab w:val="left" w:pos="1120"/>
-          <w:tab w:val="left" w:pos="1680"/>
-          <w:tab w:val="left" w:pos="2240"/>
-          <w:tab w:val="left" w:pos="2800"/>
-          <w:tab w:val="left" w:pos="3360"/>
-          <w:tab w:val="left" w:pos="3920"/>
-          <w:tab w:val="left" w:pos="4480"/>
-          <w:tab w:val="left" w:pos="5040"/>
-          <w:tab w:val="left" w:pos="5600"/>
-          <w:tab w:val="left" w:pos="6160"/>
-          <w:tab w:val="left" w:pos="6720"/>
-        </w:tabs>
-        <w:autoSpaceDE w:val="0"/>
-        <w:autoSpaceDN w:val="0"/>
-        <w:adjustRightInd w:val="0"/>
-        <w:rPr>
-          <w:rFonts w:ascii="Menlo" w:hAnsi="Menlo" w:cs="Menlo"/>
-          <w:color w:val="000000"/>
-          <w:kern w:val="0"/>
-          <w:sz w:val="22"/>
-          <w:szCs w:val="22"/>
-        </w:rPr>
-      </w:pPr>
-      <w:r>
-        <w:rPr>
-          <w:rFonts w:ascii="Menlo" w:hAnsi="Menlo" w:cs="Menlo"/>
-          <w:color w:val="000000"/>
-          <w:kern w:val="0"/>
-          <w:sz w:val="22"/>
-          <w:szCs w:val="22"/>
-        </w:rPr>
-        <w:t xml:space="preserve">        &lt;SCPDURL&gt;/IRCCSCPD.xml&lt;/SCPDURL&gt;</w:t>
-      </w:r>
-    </w:p>
-    <w:p>
-      <w:pPr>
-        <w:pBdr>
-          <w:top w:val="single" w:sz="4" w:space="1" w:color="auto" w:shadow="1"/>
-          <w:left w:val="single" w:sz="4" w:space="4" w:color="auto" w:shadow="1"/>
-          <w:bottom w:val="single" w:sz="4" w:space="1" w:color="auto" w:shadow="1"/>
-          <w:right w:val="single" w:sz="4" w:space="4" w:color="auto" w:shadow="1"/>
-        </w:pBdr>
-        <w:shd w:val="pct20" w:color="auto" w:fill="auto"/>
-        <w:tabs>
-          <w:tab w:val="left" w:pos="560"/>
-          <w:tab w:val="left" w:pos="1120"/>
-          <w:tab w:val="left" w:pos="1680"/>
-          <w:tab w:val="left" w:pos="2240"/>
-          <w:tab w:val="left" w:pos="2800"/>
-          <w:tab w:val="left" w:pos="3360"/>
-          <w:tab w:val="left" w:pos="3920"/>
-          <w:tab w:val="left" w:pos="4480"/>
-          <w:tab w:val="left" w:pos="5040"/>
-          <w:tab w:val="left" w:pos="5600"/>
-          <w:tab w:val="left" w:pos="6160"/>
-          <w:tab w:val="left" w:pos="6720"/>
-        </w:tabs>
-        <w:autoSpaceDE w:val="0"/>
-        <w:autoSpaceDN w:val="0"/>
-        <w:adjustRightInd w:val="0"/>
-        <w:rPr>
-          <w:rFonts w:ascii="Menlo" w:hAnsi="Menlo" w:cs="Menlo"/>
-          <w:color w:val="000000"/>
-          <w:kern w:val="0"/>
-          <w:sz w:val="22"/>
-          <w:szCs w:val="22"/>
-        </w:rPr>
-      </w:pPr>
-      <w:r>
-        <w:rPr>
-          <w:rFonts w:ascii="Menlo" w:hAnsi="Menlo" w:cs="Menlo"/>
-          <w:color w:val="000000"/>
-          <w:kern w:val="0"/>
-          <w:sz w:val="22"/>
-          <w:szCs w:val="22"/>
-        </w:rPr>
-        <w:t xml:space="preserve">        &lt;</w:t>
-      </w:r>
-      <w:proofErr w:type="spellStart"/>
-      <w:proofErr w:type="gramStart"/>
-      <w:r>
-        <w:rPr>
-          <w:rFonts w:ascii="Menlo" w:hAnsi="Menlo" w:cs="Menlo"/>
-          <w:color w:val="000000"/>
-          <w:kern w:val="0"/>
-          <w:sz w:val="22"/>
-          <w:szCs w:val="22"/>
-        </w:rPr>
-        <w:t>controlURL</w:t>
-      </w:r>
-      <w:proofErr w:type="spellEnd"/>
-      <w:proofErr w:type="gramEnd"/>
-      <w:r>
-        <w:rPr>
-          <w:rFonts w:ascii="Menlo" w:hAnsi="Menlo" w:cs="Menlo"/>
-          <w:color w:val="000000"/>
-          <w:kern w:val="0"/>
-          <w:sz w:val="22"/>
-          <w:szCs w:val="22"/>
-        </w:rPr>
-        <w:t>&gt;/</w:t>
-      </w:r>
-      <w:proofErr w:type="spellStart"/>
-      <w:r>
-        <w:rPr>
-          <w:rFonts w:ascii="Menlo" w:hAnsi="Menlo" w:cs="Menlo"/>
-          <w:color w:val="000000"/>
-          <w:kern w:val="0"/>
-          <w:sz w:val="22"/>
-          <w:szCs w:val="22"/>
-        </w:rPr>
-        <w:t>upnp</w:t>
-      </w:r>
-      <w:proofErr w:type="spellEnd"/>
-      <w:r>
-        <w:rPr>
-          <w:rFonts w:ascii="Menlo" w:hAnsi="Menlo" w:cs="Menlo"/>
-          <w:color w:val="000000"/>
-          <w:kern w:val="0"/>
-          <w:sz w:val="22"/>
-          <w:szCs w:val="22"/>
-        </w:rPr>
-        <w:t>/control/IRCC&lt;/</w:t>
-      </w:r>
-      <w:proofErr w:type="spellStart"/>
-      <w:r>
-        <w:rPr>
-          <w:rFonts w:ascii="Menlo" w:hAnsi="Menlo" w:cs="Menlo"/>
-          <w:color w:val="000000"/>
-          <w:kern w:val="0"/>
-          <w:sz w:val="22"/>
-          <w:szCs w:val="22"/>
-        </w:rPr>
-        <w:t>controlURL</w:t>
-      </w:r>
-      <w:proofErr w:type="spellEnd"/>
-      <w:r>
-        <w:rPr>
-          <w:rFonts w:ascii="Menlo" w:hAnsi="Menlo" w:cs="Menlo"/>
-          <w:color w:val="000000"/>
-          <w:kern w:val="0"/>
-          <w:sz w:val="22"/>
-          <w:szCs w:val="22"/>
-        </w:rPr>
-        <w:t>&gt;</w:t>
-      </w:r>
-    </w:p>
-    <w:p>
-      <w:pPr>
-        <w:pBdr>
-          <w:top w:val="single" w:sz="4" w:space="1" w:color="auto" w:shadow="1"/>
-          <w:left w:val="single" w:sz="4" w:space="4" w:color="auto" w:shadow="1"/>
-          <w:bottom w:val="single" w:sz="4" w:space="1" w:color="auto" w:shadow="1"/>
-          <w:right w:val="single" w:sz="4" w:space="4" w:color="auto" w:shadow="1"/>
-        </w:pBdr>
-        <w:shd w:val="pct20" w:color="auto" w:fill="auto"/>
-        <w:tabs>
-          <w:tab w:val="left" w:pos="560"/>
-          <w:tab w:val="left" w:pos="1120"/>
-          <w:tab w:val="left" w:pos="1680"/>
-          <w:tab w:val="left" w:pos="2240"/>
-          <w:tab w:val="left" w:pos="2800"/>
-          <w:tab w:val="left" w:pos="3360"/>
-          <w:tab w:val="left" w:pos="3920"/>
-          <w:tab w:val="left" w:pos="4480"/>
-          <w:tab w:val="left" w:pos="5040"/>
-          <w:tab w:val="left" w:pos="5600"/>
-          <w:tab w:val="left" w:pos="6160"/>
-          <w:tab w:val="left" w:pos="6720"/>
-        </w:tabs>
-        <w:autoSpaceDE w:val="0"/>
-        <w:autoSpaceDN w:val="0"/>
-        <w:adjustRightInd w:val="0"/>
-        <w:rPr>
-          <w:rFonts w:ascii="Menlo" w:hAnsi="Menlo" w:cs="Menlo"/>
-          <w:color w:val="000000"/>
-          <w:kern w:val="0"/>
-          <w:sz w:val="22"/>
-          <w:szCs w:val="22"/>
-        </w:rPr>
-      </w:pPr>
-      <w:r>
-        <w:rPr>
-          <w:rFonts w:ascii="Menlo" w:hAnsi="Menlo" w:cs="Menlo"/>
-          <w:color w:val="000000"/>
-          <w:kern w:val="0"/>
-          <w:sz w:val="22"/>
-          <w:szCs w:val="22"/>
-        </w:rPr>
         <w:lastRenderedPageBreak/>
         <w:t xml:space="preserve">        &lt;</w:t>
       </w:r>
@@ -4413,6 +3622,896 @@
           <w:sz w:val="22"/>
           <w:szCs w:val="22"/>
         </w:rPr>
+        <w:t>depth</w:t>
+      </w:r>
+      <w:proofErr w:type="spellEnd"/>
+      <w:proofErr w:type="gramEnd"/>
+      <w:r>
+        <w:rPr>
+          <w:rFonts w:ascii="Menlo" w:hAnsi="Menlo" w:cs="Menlo"/>
+          <w:color w:val="000000"/>
+          <w:kern w:val="0"/>
+          <w:sz w:val="22"/>
+          <w:szCs w:val="22"/>
+        </w:rPr>
+        <w:t>&gt;24&lt;/</w:t>
+      </w:r>
+      <w:proofErr w:type="spellStart"/>
+      <w:r>
+        <w:rPr>
+          <w:rFonts w:ascii="Menlo" w:hAnsi="Menlo" w:cs="Menlo"/>
+          <w:color w:val="000000"/>
+          <w:kern w:val="0"/>
+          <w:sz w:val="22"/>
+          <w:szCs w:val="22"/>
+        </w:rPr>
+        <w:t>depth</w:t>
+      </w:r>
+      <w:proofErr w:type="spellEnd"/>
+      <w:r>
+        <w:rPr>
+          <w:rFonts w:ascii="Menlo" w:hAnsi="Menlo" w:cs="Menlo"/>
+          <w:color w:val="000000"/>
+          <w:kern w:val="0"/>
+          <w:sz w:val="22"/>
+          <w:szCs w:val="22"/>
+        </w:rPr>
+        <w:t>&gt;</w:t>
+      </w:r>
+    </w:p>
+    <w:p>
+      <w:pPr>
+        <w:pBdr>
+          <w:top w:val="single" w:sz="4" w:space="1" w:color="auto" w:shadow="1"/>
+          <w:left w:val="single" w:sz="4" w:space="4" w:color="auto" w:shadow="1"/>
+          <w:bottom w:val="single" w:sz="4" w:space="1" w:color="auto" w:shadow="1"/>
+          <w:right w:val="single" w:sz="4" w:space="4" w:color="auto" w:shadow="1"/>
+        </w:pBdr>
+        <w:shd w:val="pct20" w:color="auto" w:fill="auto"/>
+        <w:tabs>
+          <w:tab w:val="left" w:pos="560"/>
+          <w:tab w:val="left" w:pos="1120"/>
+          <w:tab w:val="left" w:pos="1680"/>
+          <w:tab w:val="left" w:pos="2240"/>
+          <w:tab w:val="left" w:pos="2800"/>
+          <w:tab w:val="left" w:pos="3360"/>
+          <w:tab w:val="left" w:pos="3920"/>
+          <w:tab w:val="left" w:pos="4480"/>
+          <w:tab w:val="left" w:pos="5040"/>
+          <w:tab w:val="left" w:pos="5600"/>
+          <w:tab w:val="left" w:pos="6160"/>
+          <w:tab w:val="left" w:pos="6720"/>
+        </w:tabs>
+        <w:autoSpaceDE w:val="0"/>
+        <w:autoSpaceDN w:val="0"/>
+        <w:adjustRightInd w:val="0"/>
+        <w:rPr>
+          <w:rFonts w:ascii="Menlo" w:hAnsi="Menlo" w:cs="Menlo"/>
+          <w:color w:val="000000"/>
+          <w:kern w:val="0"/>
+          <w:sz w:val="22"/>
+          <w:szCs w:val="22"/>
+        </w:rPr>
+      </w:pPr>
+      <w:r>
+        <w:rPr>
+          <w:rFonts w:ascii="Menlo" w:hAnsi="Menlo" w:cs="Menlo"/>
+          <w:color w:val="000000"/>
+          <w:kern w:val="0"/>
+          <w:sz w:val="22"/>
+          <w:szCs w:val="22"/>
+        </w:rPr>
+        <w:t xml:space="preserve">        &lt;</w:t>
+      </w:r>
+      <w:proofErr w:type="gramStart"/>
+      <w:r>
+        <w:rPr>
+          <w:rFonts w:ascii="Menlo" w:hAnsi="Menlo" w:cs="Menlo"/>
+          <w:color w:val="000000"/>
+          <w:kern w:val="0"/>
+          <w:sz w:val="22"/>
+          <w:szCs w:val="22"/>
+        </w:rPr>
+        <w:t>url</w:t>
+      </w:r>
+      <w:proofErr w:type="gramEnd"/>
+      <w:r>
+        <w:rPr>
+          <w:rFonts w:ascii="Menlo" w:hAnsi="Menlo" w:cs="Menlo"/>
+          <w:color w:val="000000"/>
+          <w:kern w:val="0"/>
+          <w:sz w:val="22"/>
+          <w:szCs w:val="22"/>
+        </w:rPr>
+        <w:t>&gt;/bdp_ce_device_icon_small.png&lt;/url&gt;</w:t>
+      </w:r>
+    </w:p>
+    <w:p>
+      <w:pPr>
+        <w:pBdr>
+          <w:top w:val="single" w:sz="4" w:space="1" w:color="auto" w:shadow="1"/>
+          <w:left w:val="single" w:sz="4" w:space="4" w:color="auto" w:shadow="1"/>
+          <w:bottom w:val="single" w:sz="4" w:space="1" w:color="auto" w:shadow="1"/>
+          <w:right w:val="single" w:sz="4" w:space="4" w:color="auto" w:shadow="1"/>
+        </w:pBdr>
+        <w:shd w:val="pct20" w:color="auto" w:fill="auto"/>
+        <w:tabs>
+          <w:tab w:val="left" w:pos="560"/>
+          <w:tab w:val="left" w:pos="1120"/>
+          <w:tab w:val="left" w:pos="1680"/>
+          <w:tab w:val="left" w:pos="2240"/>
+          <w:tab w:val="left" w:pos="2800"/>
+          <w:tab w:val="left" w:pos="3360"/>
+          <w:tab w:val="left" w:pos="3920"/>
+          <w:tab w:val="left" w:pos="4480"/>
+          <w:tab w:val="left" w:pos="5040"/>
+          <w:tab w:val="left" w:pos="5600"/>
+          <w:tab w:val="left" w:pos="6160"/>
+          <w:tab w:val="left" w:pos="6720"/>
+        </w:tabs>
+        <w:autoSpaceDE w:val="0"/>
+        <w:autoSpaceDN w:val="0"/>
+        <w:adjustRightInd w:val="0"/>
+        <w:rPr>
+          <w:rFonts w:ascii="Menlo" w:hAnsi="Menlo" w:cs="Menlo"/>
+          <w:color w:val="000000"/>
+          <w:kern w:val="0"/>
+          <w:sz w:val="22"/>
+          <w:szCs w:val="22"/>
+        </w:rPr>
+      </w:pPr>
+      <w:r>
+        <w:rPr>
+          <w:rFonts w:ascii="Menlo" w:hAnsi="Menlo" w:cs="Menlo"/>
+          <w:color w:val="000000"/>
+          <w:kern w:val="0"/>
+          <w:sz w:val="22"/>
+          <w:szCs w:val="22"/>
+        </w:rPr>
+        <w:t xml:space="preserve">      &lt;/</w:t>
+      </w:r>
+      <w:proofErr w:type="spellStart"/>
+      <w:r>
+        <w:rPr>
+          <w:rFonts w:ascii="Menlo" w:hAnsi="Menlo" w:cs="Menlo"/>
+          <w:color w:val="000000"/>
+          <w:kern w:val="0"/>
+          <w:sz w:val="22"/>
+          <w:szCs w:val="22"/>
+        </w:rPr>
+        <w:t>icon</w:t>
+      </w:r>
+      <w:proofErr w:type="spellEnd"/>
+      <w:r>
+        <w:rPr>
+          <w:rFonts w:ascii="Menlo" w:hAnsi="Menlo" w:cs="Menlo"/>
+          <w:color w:val="000000"/>
+          <w:kern w:val="0"/>
+          <w:sz w:val="22"/>
+          <w:szCs w:val="22"/>
+        </w:rPr>
+        <w:t>&gt;</w:t>
+      </w:r>
+    </w:p>
+    <w:p>
+      <w:pPr>
+        <w:pBdr>
+          <w:top w:val="single" w:sz="4" w:space="1" w:color="auto" w:shadow="1"/>
+          <w:left w:val="single" w:sz="4" w:space="4" w:color="auto" w:shadow="1"/>
+          <w:bottom w:val="single" w:sz="4" w:space="1" w:color="auto" w:shadow="1"/>
+          <w:right w:val="single" w:sz="4" w:space="4" w:color="auto" w:shadow="1"/>
+        </w:pBdr>
+        <w:shd w:val="pct20" w:color="auto" w:fill="auto"/>
+        <w:tabs>
+          <w:tab w:val="left" w:pos="560"/>
+          <w:tab w:val="left" w:pos="1120"/>
+          <w:tab w:val="left" w:pos="1680"/>
+          <w:tab w:val="left" w:pos="2240"/>
+          <w:tab w:val="left" w:pos="2800"/>
+          <w:tab w:val="left" w:pos="3360"/>
+          <w:tab w:val="left" w:pos="3920"/>
+          <w:tab w:val="left" w:pos="4480"/>
+          <w:tab w:val="left" w:pos="5040"/>
+          <w:tab w:val="left" w:pos="5600"/>
+          <w:tab w:val="left" w:pos="6160"/>
+          <w:tab w:val="left" w:pos="6720"/>
+        </w:tabs>
+        <w:autoSpaceDE w:val="0"/>
+        <w:autoSpaceDN w:val="0"/>
+        <w:adjustRightInd w:val="0"/>
+        <w:rPr>
+          <w:rFonts w:ascii="Menlo" w:hAnsi="Menlo" w:cs="Menlo"/>
+          <w:color w:val="000000"/>
+          <w:kern w:val="0"/>
+          <w:sz w:val="22"/>
+          <w:szCs w:val="22"/>
+        </w:rPr>
+      </w:pPr>
+      <w:r>
+        <w:rPr>
+          <w:rFonts w:ascii="Menlo" w:hAnsi="Menlo" w:cs="Menlo"/>
+          <w:color w:val="000000"/>
+          <w:kern w:val="0"/>
+          <w:sz w:val="22"/>
+          <w:szCs w:val="22"/>
+        </w:rPr>
+        <w:t xml:space="preserve">    &lt;/</w:t>
+      </w:r>
+      <w:proofErr w:type="spellStart"/>
+      <w:r>
+        <w:rPr>
+          <w:rFonts w:ascii="Menlo" w:hAnsi="Menlo" w:cs="Menlo"/>
+          <w:color w:val="000000"/>
+          <w:kern w:val="0"/>
+          <w:sz w:val="22"/>
+          <w:szCs w:val="22"/>
+        </w:rPr>
+        <w:t>iconList</w:t>
+      </w:r>
+      <w:proofErr w:type="spellEnd"/>
+      <w:r>
+        <w:rPr>
+          <w:rFonts w:ascii="Menlo" w:hAnsi="Menlo" w:cs="Menlo"/>
+          <w:color w:val="000000"/>
+          <w:kern w:val="0"/>
+          <w:sz w:val="22"/>
+          <w:szCs w:val="22"/>
+        </w:rPr>
+        <w:t>&gt;</w:t>
+      </w:r>
+    </w:p>
+    <w:p>
+      <w:pPr>
+        <w:pBdr>
+          <w:top w:val="single" w:sz="4" w:space="1" w:color="auto" w:shadow="1"/>
+          <w:left w:val="single" w:sz="4" w:space="4" w:color="auto" w:shadow="1"/>
+          <w:bottom w:val="single" w:sz="4" w:space="1" w:color="auto" w:shadow="1"/>
+          <w:right w:val="single" w:sz="4" w:space="4" w:color="auto" w:shadow="1"/>
+        </w:pBdr>
+        <w:shd w:val="pct20" w:color="auto" w:fill="auto"/>
+        <w:tabs>
+          <w:tab w:val="left" w:pos="560"/>
+          <w:tab w:val="left" w:pos="1120"/>
+          <w:tab w:val="left" w:pos="1680"/>
+          <w:tab w:val="left" w:pos="2240"/>
+          <w:tab w:val="left" w:pos="2800"/>
+          <w:tab w:val="left" w:pos="3360"/>
+          <w:tab w:val="left" w:pos="3920"/>
+          <w:tab w:val="left" w:pos="4480"/>
+          <w:tab w:val="left" w:pos="5040"/>
+          <w:tab w:val="left" w:pos="5600"/>
+          <w:tab w:val="left" w:pos="6160"/>
+          <w:tab w:val="left" w:pos="6720"/>
+        </w:tabs>
+        <w:autoSpaceDE w:val="0"/>
+        <w:autoSpaceDN w:val="0"/>
+        <w:adjustRightInd w:val="0"/>
+        <w:rPr>
+          <w:rFonts w:ascii="Menlo" w:hAnsi="Menlo" w:cs="Menlo"/>
+          <w:color w:val="000000"/>
+          <w:kern w:val="0"/>
+          <w:sz w:val="22"/>
+          <w:szCs w:val="22"/>
+        </w:rPr>
+      </w:pPr>
+      <w:r>
+        <w:rPr>
+          <w:rFonts w:ascii="Menlo" w:hAnsi="Menlo" w:cs="Menlo"/>
+          <w:color w:val="000000"/>
+          <w:kern w:val="0"/>
+          <w:sz w:val="22"/>
+          <w:szCs w:val="22"/>
+        </w:rPr>
+        <w:t xml:space="preserve">    &lt;</w:t>
+      </w:r>
+      <w:proofErr w:type="spellStart"/>
+      <w:proofErr w:type="gramStart"/>
+      <w:r>
+        <w:rPr>
+          <w:rFonts w:ascii="Menlo" w:hAnsi="Menlo" w:cs="Menlo"/>
+          <w:color w:val="000000"/>
+          <w:kern w:val="0"/>
+          <w:sz w:val="22"/>
+          <w:szCs w:val="22"/>
+        </w:rPr>
+        <w:t>serviceList</w:t>
+      </w:r>
+      <w:proofErr w:type="spellEnd"/>
+      <w:proofErr w:type="gramEnd"/>
+      <w:r>
+        <w:rPr>
+          <w:rFonts w:ascii="Menlo" w:hAnsi="Menlo" w:cs="Menlo"/>
+          <w:color w:val="000000"/>
+          <w:kern w:val="0"/>
+          <w:sz w:val="22"/>
+          <w:szCs w:val="22"/>
+        </w:rPr>
+        <w:t>&gt;</w:t>
+      </w:r>
+    </w:p>
+    <w:p>
+      <w:pPr>
+        <w:pBdr>
+          <w:top w:val="single" w:sz="4" w:space="1" w:color="auto" w:shadow="1"/>
+          <w:left w:val="single" w:sz="4" w:space="4" w:color="auto" w:shadow="1"/>
+          <w:bottom w:val="single" w:sz="4" w:space="1" w:color="auto" w:shadow="1"/>
+          <w:right w:val="single" w:sz="4" w:space="4" w:color="auto" w:shadow="1"/>
+        </w:pBdr>
+        <w:shd w:val="pct20" w:color="auto" w:fill="auto"/>
+        <w:tabs>
+          <w:tab w:val="left" w:pos="560"/>
+          <w:tab w:val="left" w:pos="1120"/>
+          <w:tab w:val="left" w:pos="1680"/>
+          <w:tab w:val="left" w:pos="2240"/>
+          <w:tab w:val="left" w:pos="2800"/>
+          <w:tab w:val="left" w:pos="3360"/>
+          <w:tab w:val="left" w:pos="3920"/>
+          <w:tab w:val="left" w:pos="4480"/>
+          <w:tab w:val="left" w:pos="5040"/>
+          <w:tab w:val="left" w:pos="5600"/>
+          <w:tab w:val="left" w:pos="6160"/>
+          <w:tab w:val="left" w:pos="6720"/>
+        </w:tabs>
+        <w:autoSpaceDE w:val="0"/>
+        <w:autoSpaceDN w:val="0"/>
+        <w:adjustRightInd w:val="0"/>
+        <w:rPr>
+          <w:rFonts w:ascii="Menlo" w:hAnsi="Menlo" w:cs="Menlo"/>
+          <w:color w:val="000000"/>
+          <w:kern w:val="0"/>
+          <w:sz w:val="22"/>
+          <w:szCs w:val="22"/>
+        </w:rPr>
+      </w:pPr>
+      <w:r>
+        <w:rPr>
+          <w:rFonts w:ascii="Menlo" w:hAnsi="Menlo" w:cs="Menlo"/>
+          <w:color w:val="000000"/>
+          <w:kern w:val="0"/>
+          <w:sz w:val="22"/>
+          <w:szCs w:val="22"/>
+        </w:rPr>
+        <w:t xml:space="preserve">      &lt;</w:t>
+      </w:r>
+      <w:proofErr w:type="gramStart"/>
+      <w:r>
+        <w:rPr>
+          <w:rFonts w:ascii="Menlo" w:hAnsi="Menlo" w:cs="Menlo"/>
+          <w:color w:val="000000"/>
+          <w:kern w:val="0"/>
+          <w:sz w:val="22"/>
+          <w:szCs w:val="22"/>
+        </w:rPr>
+        <w:t>service</w:t>
+      </w:r>
+      <w:proofErr w:type="gramEnd"/>
+      <w:r>
+        <w:rPr>
+          <w:rFonts w:ascii="Menlo" w:hAnsi="Menlo" w:cs="Menlo"/>
+          <w:color w:val="000000"/>
+          <w:kern w:val="0"/>
+          <w:sz w:val="22"/>
+          <w:szCs w:val="22"/>
+        </w:rPr>
+        <w:t>&gt;</w:t>
+      </w:r>
+    </w:p>
+    <w:p>
+      <w:pPr>
+        <w:pBdr>
+          <w:top w:val="single" w:sz="4" w:space="1" w:color="auto" w:shadow="1"/>
+          <w:left w:val="single" w:sz="4" w:space="4" w:color="auto" w:shadow="1"/>
+          <w:bottom w:val="single" w:sz="4" w:space="1" w:color="auto" w:shadow="1"/>
+          <w:right w:val="single" w:sz="4" w:space="4" w:color="auto" w:shadow="1"/>
+        </w:pBdr>
+        <w:shd w:val="pct20" w:color="auto" w:fill="auto"/>
+        <w:tabs>
+          <w:tab w:val="left" w:pos="560"/>
+          <w:tab w:val="left" w:pos="1120"/>
+          <w:tab w:val="left" w:pos="1680"/>
+          <w:tab w:val="left" w:pos="2240"/>
+          <w:tab w:val="left" w:pos="2800"/>
+          <w:tab w:val="left" w:pos="3360"/>
+          <w:tab w:val="left" w:pos="3920"/>
+          <w:tab w:val="left" w:pos="4480"/>
+          <w:tab w:val="left" w:pos="5040"/>
+          <w:tab w:val="left" w:pos="5600"/>
+          <w:tab w:val="left" w:pos="6160"/>
+          <w:tab w:val="left" w:pos="6720"/>
+        </w:tabs>
+        <w:autoSpaceDE w:val="0"/>
+        <w:autoSpaceDN w:val="0"/>
+        <w:adjustRightInd w:val="0"/>
+        <w:rPr>
+          <w:rFonts w:ascii="Menlo" w:hAnsi="Menlo" w:cs="Menlo"/>
+          <w:color w:val="000000"/>
+          <w:kern w:val="0"/>
+          <w:sz w:val="22"/>
+          <w:szCs w:val="22"/>
+        </w:rPr>
+      </w:pPr>
+      <w:r>
+        <w:rPr>
+          <w:rFonts w:ascii="Menlo" w:hAnsi="Menlo" w:cs="Menlo"/>
+          <w:color w:val="000000"/>
+          <w:kern w:val="0"/>
+          <w:sz w:val="22"/>
+          <w:szCs w:val="22"/>
+        </w:rPr>
+        <w:t xml:space="preserve">        &lt;</w:t>
+      </w:r>
+      <w:proofErr w:type="spellStart"/>
+      <w:proofErr w:type="gramStart"/>
+      <w:r>
+        <w:rPr>
+          <w:rFonts w:ascii="Menlo" w:hAnsi="Menlo" w:cs="Menlo"/>
+          <w:color w:val="000000"/>
+          <w:kern w:val="0"/>
+          <w:sz w:val="22"/>
+          <w:szCs w:val="22"/>
+        </w:rPr>
+        <w:t>serviceType</w:t>
+      </w:r>
+      <w:proofErr w:type="spellEnd"/>
+      <w:proofErr w:type="gramEnd"/>
+      <w:r>
+        <w:rPr>
+          <w:rFonts w:ascii="Menlo" w:hAnsi="Menlo" w:cs="Menlo"/>
+          <w:color w:val="000000"/>
+          <w:kern w:val="0"/>
+          <w:sz w:val="22"/>
+          <w:szCs w:val="22"/>
+        </w:rPr>
+        <w:t>&gt;</w:t>
+      </w:r>
+      <w:proofErr w:type="gramStart"/>
+      <w:r>
+        <w:rPr>
+          <w:rFonts w:ascii="Menlo" w:hAnsi="Menlo" w:cs="Menlo"/>
+          <w:color w:val="000000"/>
+          <w:kern w:val="0"/>
+          <w:sz w:val="22"/>
+          <w:szCs w:val="22"/>
+        </w:rPr>
+        <w:t>urn:schemas</w:t>
+      </w:r>
+      <w:proofErr w:type="gramEnd"/>
+      <w:r>
+        <w:rPr>
+          <w:rFonts w:ascii="Menlo" w:hAnsi="Menlo" w:cs="Menlo"/>
+          <w:color w:val="000000"/>
+          <w:kern w:val="0"/>
+          <w:sz w:val="22"/>
+          <w:szCs w:val="22"/>
+        </w:rPr>
+        <w:t>-sony-</w:t>
+      </w:r>
+      <w:proofErr w:type="gramStart"/>
+      <w:r>
+        <w:rPr>
+          <w:rFonts w:ascii="Menlo" w:hAnsi="Menlo" w:cs="Menlo"/>
+          <w:color w:val="000000"/>
+          <w:kern w:val="0"/>
+          <w:sz w:val="22"/>
+          <w:szCs w:val="22"/>
+        </w:rPr>
+        <w:t>com:service</w:t>
+      </w:r>
+      <w:proofErr w:type="gramEnd"/>
+      <w:r>
+        <w:rPr>
+          <w:rFonts w:ascii="Menlo" w:hAnsi="Menlo" w:cs="Menlo"/>
+          <w:color w:val="000000"/>
+          <w:kern w:val="0"/>
+          <w:sz w:val="22"/>
+          <w:szCs w:val="22"/>
+        </w:rPr>
+        <w:t>:</w:t>
+      </w:r>
+      <w:proofErr w:type="gramStart"/>
+      <w:r>
+        <w:rPr>
+          <w:rFonts w:ascii="Menlo" w:hAnsi="Menlo" w:cs="Menlo"/>
+          <w:color w:val="000000"/>
+          <w:kern w:val="0"/>
+          <w:sz w:val="22"/>
+          <w:szCs w:val="22"/>
+        </w:rPr>
+        <w:t>IRCC:</w:t>
+      </w:r>
+      <w:proofErr w:type="gramEnd"/>
+      <w:r>
+        <w:rPr>
+          <w:rFonts w:ascii="Menlo" w:hAnsi="Menlo" w:cs="Menlo"/>
+          <w:color w:val="000000"/>
+          <w:kern w:val="0"/>
+          <w:sz w:val="22"/>
+          <w:szCs w:val="22"/>
+        </w:rPr>
+        <w:t>1&lt;/</w:t>
+      </w:r>
+      <w:proofErr w:type="spellStart"/>
+      <w:r>
+        <w:rPr>
+          <w:rFonts w:ascii="Menlo" w:hAnsi="Menlo" w:cs="Menlo"/>
+          <w:color w:val="000000"/>
+          <w:kern w:val="0"/>
+          <w:sz w:val="22"/>
+          <w:szCs w:val="22"/>
+        </w:rPr>
+        <w:t>serviceType</w:t>
+      </w:r>
+      <w:proofErr w:type="spellEnd"/>
+      <w:r>
+        <w:rPr>
+          <w:rFonts w:ascii="Menlo" w:hAnsi="Menlo" w:cs="Menlo"/>
+          <w:color w:val="000000"/>
+          <w:kern w:val="0"/>
+          <w:sz w:val="22"/>
+          <w:szCs w:val="22"/>
+        </w:rPr>
+        <w:t>&gt;</w:t>
+      </w:r>
+    </w:p>
+    <w:p>
+      <w:pPr>
+        <w:pBdr>
+          <w:top w:val="single" w:sz="4" w:space="1" w:color="auto" w:shadow="1"/>
+          <w:left w:val="single" w:sz="4" w:space="4" w:color="auto" w:shadow="1"/>
+          <w:bottom w:val="single" w:sz="4" w:space="1" w:color="auto" w:shadow="1"/>
+          <w:right w:val="single" w:sz="4" w:space="4" w:color="auto" w:shadow="1"/>
+        </w:pBdr>
+        <w:shd w:val="pct20" w:color="auto" w:fill="auto"/>
+        <w:tabs>
+          <w:tab w:val="left" w:pos="560"/>
+          <w:tab w:val="left" w:pos="1120"/>
+          <w:tab w:val="left" w:pos="1680"/>
+          <w:tab w:val="left" w:pos="2240"/>
+          <w:tab w:val="left" w:pos="2800"/>
+          <w:tab w:val="left" w:pos="3360"/>
+          <w:tab w:val="left" w:pos="3920"/>
+          <w:tab w:val="left" w:pos="4480"/>
+          <w:tab w:val="left" w:pos="5040"/>
+          <w:tab w:val="left" w:pos="5600"/>
+          <w:tab w:val="left" w:pos="6160"/>
+          <w:tab w:val="left" w:pos="6720"/>
+        </w:tabs>
+        <w:autoSpaceDE w:val="0"/>
+        <w:autoSpaceDN w:val="0"/>
+        <w:adjustRightInd w:val="0"/>
+        <w:rPr>
+          <w:rFonts w:ascii="Menlo" w:hAnsi="Menlo" w:cs="Menlo"/>
+          <w:color w:val="000000"/>
+          <w:kern w:val="0"/>
+          <w:sz w:val="22"/>
+          <w:szCs w:val="22"/>
+        </w:rPr>
+      </w:pPr>
+      <w:r>
+        <w:rPr>
+          <w:rFonts w:ascii="Menlo" w:hAnsi="Menlo" w:cs="Menlo"/>
+          <w:color w:val="000000"/>
+          <w:kern w:val="0"/>
+          <w:sz w:val="22"/>
+          <w:szCs w:val="22"/>
+        </w:rPr>
+        <w:t xml:space="preserve">        &lt;</w:t>
+      </w:r>
+      <w:proofErr w:type="spellStart"/>
+      <w:proofErr w:type="gramStart"/>
+      <w:r>
+        <w:rPr>
+          <w:rFonts w:ascii="Menlo" w:hAnsi="Menlo" w:cs="Menlo"/>
+          <w:color w:val="000000"/>
+          <w:kern w:val="0"/>
+          <w:sz w:val="22"/>
+          <w:szCs w:val="22"/>
+        </w:rPr>
+        <w:t>serviceId</w:t>
+      </w:r>
+      <w:proofErr w:type="spellEnd"/>
+      <w:proofErr w:type="gramEnd"/>
+      <w:r>
+        <w:rPr>
+          <w:rFonts w:ascii="Menlo" w:hAnsi="Menlo" w:cs="Menlo"/>
+          <w:color w:val="000000"/>
+          <w:kern w:val="0"/>
+          <w:sz w:val="22"/>
+          <w:szCs w:val="22"/>
+        </w:rPr>
+        <w:t>&gt;</w:t>
+      </w:r>
+      <w:proofErr w:type="spellStart"/>
+      <w:proofErr w:type="gramStart"/>
+      <w:r>
+        <w:rPr>
+          <w:rFonts w:ascii="Menlo" w:hAnsi="Menlo" w:cs="Menlo"/>
+          <w:color w:val="000000"/>
+          <w:kern w:val="0"/>
+          <w:sz w:val="22"/>
+          <w:szCs w:val="22"/>
+        </w:rPr>
+        <w:t>urn:schemas</w:t>
+      </w:r>
+      <w:proofErr w:type="gramEnd"/>
+      <w:r>
+        <w:rPr>
+          <w:rFonts w:ascii="Menlo" w:hAnsi="Menlo" w:cs="Menlo"/>
+          <w:color w:val="000000"/>
+          <w:kern w:val="0"/>
+          <w:sz w:val="22"/>
+          <w:szCs w:val="22"/>
+        </w:rPr>
+        <w:t>-sony-</w:t>
+      </w:r>
+      <w:proofErr w:type="gramStart"/>
+      <w:r>
+        <w:rPr>
+          <w:rFonts w:ascii="Menlo" w:hAnsi="Menlo" w:cs="Menlo"/>
+          <w:color w:val="000000"/>
+          <w:kern w:val="0"/>
+          <w:sz w:val="22"/>
+          <w:szCs w:val="22"/>
+        </w:rPr>
+        <w:t>com:serviceId</w:t>
+      </w:r>
+      <w:proofErr w:type="gramEnd"/>
+      <w:r>
+        <w:rPr>
+          <w:rFonts w:ascii="Menlo" w:hAnsi="Menlo" w:cs="Menlo"/>
+          <w:color w:val="000000"/>
+          <w:kern w:val="0"/>
+          <w:sz w:val="22"/>
+          <w:szCs w:val="22"/>
+        </w:rPr>
+        <w:t>:IRCC</w:t>
+      </w:r>
+      <w:proofErr w:type="spellEnd"/>
+      <w:r>
+        <w:rPr>
+          <w:rFonts w:ascii="Menlo" w:hAnsi="Menlo" w:cs="Menlo"/>
+          <w:color w:val="000000"/>
+          <w:kern w:val="0"/>
+          <w:sz w:val="22"/>
+          <w:szCs w:val="22"/>
+        </w:rPr>
+        <w:t>&lt;/</w:t>
+      </w:r>
+      <w:proofErr w:type="spellStart"/>
+      <w:r>
+        <w:rPr>
+          <w:rFonts w:ascii="Menlo" w:hAnsi="Menlo" w:cs="Menlo"/>
+          <w:color w:val="000000"/>
+          <w:kern w:val="0"/>
+          <w:sz w:val="22"/>
+          <w:szCs w:val="22"/>
+        </w:rPr>
+        <w:t>serviceId</w:t>
+      </w:r>
+      <w:proofErr w:type="spellEnd"/>
+      <w:r>
+        <w:rPr>
+          <w:rFonts w:ascii="Menlo" w:hAnsi="Menlo" w:cs="Menlo"/>
+          <w:color w:val="000000"/>
+          <w:kern w:val="0"/>
+          <w:sz w:val="22"/>
+          <w:szCs w:val="22"/>
+        </w:rPr>
+        <w:t>&gt;</w:t>
+      </w:r>
+    </w:p>
+    <w:p>
+      <w:pPr>
+        <w:pBdr>
+          <w:top w:val="single" w:sz="4" w:space="1" w:color="auto" w:shadow="1"/>
+          <w:left w:val="single" w:sz="4" w:space="4" w:color="auto" w:shadow="1"/>
+          <w:bottom w:val="single" w:sz="4" w:space="1" w:color="auto" w:shadow="1"/>
+          <w:right w:val="single" w:sz="4" w:space="4" w:color="auto" w:shadow="1"/>
+        </w:pBdr>
+        <w:shd w:val="pct20" w:color="auto" w:fill="auto"/>
+        <w:tabs>
+          <w:tab w:val="left" w:pos="560"/>
+          <w:tab w:val="left" w:pos="1120"/>
+          <w:tab w:val="left" w:pos="1680"/>
+          <w:tab w:val="left" w:pos="2240"/>
+          <w:tab w:val="left" w:pos="2800"/>
+          <w:tab w:val="left" w:pos="3360"/>
+          <w:tab w:val="left" w:pos="3920"/>
+          <w:tab w:val="left" w:pos="4480"/>
+          <w:tab w:val="left" w:pos="5040"/>
+          <w:tab w:val="left" w:pos="5600"/>
+          <w:tab w:val="left" w:pos="6160"/>
+          <w:tab w:val="left" w:pos="6720"/>
+        </w:tabs>
+        <w:autoSpaceDE w:val="0"/>
+        <w:autoSpaceDN w:val="0"/>
+        <w:adjustRightInd w:val="0"/>
+        <w:rPr>
+          <w:rFonts w:ascii="Menlo" w:hAnsi="Menlo" w:cs="Menlo"/>
+          <w:color w:val="000000"/>
+          <w:kern w:val="0"/>
+          <w:sz w:val="22"/>
+          <w:szCs w:val="22"/>
+        </w:rPr>
+      </w:pPr>
+      <w:r>
+        <w:rPr>
+          <w:rFonts w:ascii="Menlo" w:hAnsi="Menlo" w:cs="Menlo"/>
+          <w:color w:val="000000"/>
+          <w:kern w:val="0"/>
+          <w:sz w:val="22"/>
+          <w:szCs w:val="22"/>
+        </w:rPr>
+        <w:t xml:space="preserve">        &lt;SCPDURL&gt;/IRCCSCPD.xml&lt;/SCPDURL&gt;</w:t>
+      </w:r>
+    </w:p>
+    <w:p>
+      <w:pPr>
+        <w:pBdr>
+          <w:top w:val="single" w:sz="4" w:space="1" w:color="auto" w:shadow="1"/>
+          <w:left w:val="single" w:sz="4" w:space="4" w:color="auto" w:shadow="1"/>
+          <w:bottom w:val="single" w:sz="4" w:space="1" w:color="auto" w:shadow="1"/>
+          <w:right w:val="single" w:sz="4" w:space="4" w:color="auto" w:shadow="1"/>
+        </w:pBdr>
+        <w:shd w:val="pct20" w:color="auto" w:fill="auto"/>
+        <w:tabs>
+          <w:tab w:val="left" w:pos="560"/>
+          <w:tab w:val="left" w:pos="1120"/>
+          <w:tab w:val="left" w:pos="1680"/>
+          <w:tab w:val="left" w:pos="2240"/>
+          <w:tab w:val="left" w:pos="2800"/>
+          <w:tab w:val="left" w:pos="3360"/>
+          <w:tab w:val="left" w:pos="3920"/>
+          <w:tab w:val="left" w:pos="4480"/>
+          <w:tab w:val="left" w:pos="5040"/>
+          <w:tab w:val="left" w:pos="5600"/>
+          <w:tab w:val="left" w:pos="6160"/>
+          <w:tab w:val="left" w:pos="6720"/>
+        </w:tabs>
+        <w:autoSpaceDE w:val="0"/>
+        <w:autoSpaceDN w:val="0"/>
+        <w:adjustRightInd w:val="0"/>
+        <w:rPr>
+          <w:rFonts w:ascii="Menlo" w:hAnsi="Menlo" w:cs="Menlo"/>
+          <w:color w:val="000000"/>
+          <w:kern w:val="0"/>
+          <w:sz w:val="22"/>
+          <w:szCs w:val="22"/>
+        </w:rPr>
+      </w:pPr>
+      <w:r>
+        <w:rPr>
+          <w:rFonts w:ascii="Menlo" w:hAnsi="Menlo" w:cs="Menlo"/>
+          <w:color w:val="000000"/>
+          <w:kern w:val="0"/>
+          <w:sz w:val="22"/>
+          <w:szCs w:val="22"/>
+        </w:rPr>
+        <w:t xml:space="preserve">        &lt;</w:t>
+      </w:r>
+      <w:proofErr w:type="spellStart"/>
+      <w:proofErr w:type="gramStart"/>
+      <w:r>
+        <w:rPr>
+          <w:rFonts w:ascii="Menlo" w:hAnsi="Menlo" w:cs="Menlo"/>
+          <w:color w:val="000000"/>
+          <w:kern w:val="0"/>
+          <w:sz w:val="22"/>
+          <w:szCs w:val="22"/>
+        </w:rPr>
+        <w:t>controlURL</w:t>
+      </w:r>
+      <w:proofErr w:type="spellEnd"/>
+      <w:proofErr w:type="gramEnd"/>
+      <w:r>
+        <w:rPr>
+          <w:rFonts w:ascii="Menlo" w:hAnsi="Menlo" w:cs="Menlo"/>
+          <w:color w:val="000000"/>
+          <w:kern w:val="0"/>
+          <w:sz w:val="22"/>
+          <w:szCs w:val="22"/>
+        </w:rPr>
+        <w:t>&gt;/</w:t>
+      </w:r>
+      <w:proofErr w:type="spellStart"/>
+      <w:r>
+        <w:rPr>
+          <w:rFonts w:ascii="Menlo" w:hAnsi="Menlo" w:cs="Menlo"/>
+          <w:color w:val="000000"/>
+          <w:kern w:val="0"/>
+          <w:sz w:val="22"/>
+          <w:szCs w:val="22"/>
+        </w:rPr>
+        <w:t>upnp</w:t>
+      </w:r>
+      <w:proofErr w:type="spellEnd"/>
+      <w:r>
+        <w:rPr>
+          <w:rFonts w:ascii="Menlo" w:hAnsi="Menlo" w:cs="Menlo"/>
+          <w:color w:val="000000"/>
+          <w:kern w:val="0"/>
+          <w:sz w:val="22"/>
+          <w:szCs w:val="22"/>
+        </w:rPr>
+        <w:t>/control/IRCC&lt;/</w:t>
+      </w:r>
+      <w:proofErr w:type="spellStart"/>
+      <w:r>
+        <w:rPr>
+          <w:rFonts w:ascii="Menlo" w:hAnsi="Menlo" w:cs="Menlo"/>
+          <w:color w:val="000000"/>
+          <w:kern w:val="0"/>
+          <w:sz w:val="22"/>
+          <w:szCs w:val="22"/>
+        </w:rPr>
+        <w:t>controlURL</w:t>
+      </w:r>
+      <w:proofErr w:type="spellEnd"/>
+      <w:r>
+        <w:rPr>
+          <w:rFonts w:ascii="Menlo" w:hAnsi="Menlo" w:cs="Menlo"/>
+          <w:color w:val="000000"/>
+          <w:kern w:val="0"/>
+          <w:sz w:val="22"/>
+          <w:szCs w:val="22"/>
+        </w:rPr>
+        <w:t>&gt;</w:t>
+      </w:r>
+    </w:p>
+    <w:p>
+      <w:pPr>
+        <w:pBdr>
+          <w:top w:val="single" w:sz="4" w:space="1" w:color="auto" w:shadow="1"/>
+          <w:left w:val="single" w:sz="4" w:space="4" w:color="auto" w:shadow="1"/>
+          <w:bottom w:val="single" w:sz="4" w:space="1" w:color="auto" w:shadow="1"/>
+          <w:right w:val="single" w:sz="4" w:space="4" w:color="auto" w:shadow="1"/>
+        </w:pBdr>
+        <w:shd w:val="pct20" w:color="auto" w:fill="auto"/>
+        <w:tabs>
+          <w:tab w:val="left" w:pos="560"/>
+          <w:tab w:val="left" w:pos="1120"/>
+          <w:tab w:val="left" w:pos="1680"/>
+          <w:tab w:val="left" w:pos="2240"/>
+          <w:tab w:val="left" w:pos="2800"/>
+          <w:tab w:val="left" w:pos="3360"/>
+          <w:tab w:val="left" w:pos="3920"/>
+          <w:tab w:val="left" w:pos="4480"/>
+          <w:tab w:val="left" w:pos="5040"/>
+          <w:tab w:val="left" w:pos="5600"/>
+          <w:tab w:val="left" w:pos="6160"/>
+          <w:tab w:val="left" w:pos="6720"/>
+        </w:tabs>
+        <w:autoSpaceDE w:val="0"/>
+        <w:autoSpaceDN w:val="0"/>
+        <w:adjustRightInd w:val="0"/>
+        <w:rPr>
+          <w:rFonts w:ascii="Menlo" w:hAnsi="Menlo" w:cs="Menlo"/>
+          <w:color w:val="000000"/>
+          <w:kern w:val="0"/>
+          <w:sz w:val="22"/>
+          <w:szCs w:val="22"/>
+        </w:rPr>
+      </w:pPr>
+      <w:r>
+        <w:rPr>
+          <w:rFonts w:ascii="Menlo" w:hAnsi="Menlo" w:cs="Menlo"/>
+          <w:color w:val="000000"/>
+          <w:kern w:val="0"/>
+          <w:sz w:val="22"/>
+          <w:szCs w:val="22"/>
+        </w:rPr>
+        <w:t xml:space="preserve">        &lt;</w:t>
+      </w:r>
+      <w:proofErr w:type="spellStart"/>
+      <w:proofErr w:type="gramStart"/>
+      <w:r>
+        <w:rPr>
+          <w:rFonts w:ascii="Menlo" w:hAnsi="Menlo" w:cs="Menlo"/>
+          <w:color w:val="000000"/>
+          <w:kern w:val="0"/>
+          <w:sz w:val="22"/>
+          <w:szCs w:val="22"/>
+        </w:rPr>
         <w:t>eventSubURL</w:t>
       </w:r>
       <w:proofErr w:type="spellEnd"/>
@@ -7604,6 +7703,7 @@
           <w:sz w:val="22"/>
           <w:szCs w:val="22"/>
         </w:rPr>
+        <w:lastRenderedPageBreak/>
         <w:t xml:space="preserve">          &lt;</w:t>
       </w:r>
       <w:proofErr w:type="gramStart"/>
@@ -8302,7 +8402,6 @@
           <w:sz w:val="22"/>
           <w:szCs w:val="22"/>
         </w:rPr>
-        <w:lastRenderedPageBreak/>
         <w:t xml:space="preserve">          &lt;</w:t>
       </w:r>
       <w:proofErr w:type="gramStart"/>
@@ -11017,6 +11116,127 @@
     </w:sectPr>
   </w:body>
 </w:document>
+</file>
+
+<file path=word/numbering.xml><?xml version="1.0" encoding="utf-8"?>
+<w:numbering xmlns:wpc="http://schemas.microsoft.com/office/word/2010/wordprocessingCanvas" xmlns:cx="http://schemas.microsoft.com/office/drawing/2014/chartex" xmlns:cx1="http://schemas.microsoft.com/office/drawing/2015/9/8/chartex" xmlns:cx2="http://schemas.microsoft.com/office/drawing/2015/10/21/chartex" xmlns:cx3="http://schemas.microsoft.com/office/drawing/2016/5/9/chartex" xmlns:cx4="http://schemas.microsoft.com/office/drawing/2016/5/10/chartex" xmlns:cx5="http://schemas.microsoft.com/office/drawing/2016/5/11/chartex" xmlns:cx6="http://schemas.microsoft.com/office/drawing/2016/5/12/chartex" xmlns:cx7="http://schemas.microsoft.com/office/drawing/2016/5/13/chartex" xmlns:cx8="http://schemas.microsoft.com/office/drawing/2016/5/14/chartex" xmlns:mc="http://schemas.openxmlformats.org/markup-compatibility/2006" xmlns:aink="http://schemas.microsoft.com/office/drawing/2016/ink" xmlns:am3d="http://schemas.microsoft.com/office/drawing/2017/model3d" xmlns:o="urn:schemas-microsoft-com:office:office" xmlns:oel="http://schemas.microsoft.com/office/2019/extlst" xmlns:r="http://schemas.openxmlformats.org/officeDocument/2006/relationships" xmlns:m="http://schemas.openxmlformats.org/officeDocument/2006/math" xmlns:v="urn:schemas-microsoft-com:vml" xmlns:wp14="http://schemas.microsoft.com/office/word/2010/wordprocessingDrawing" xmlns:wp="http://schemas.openxmlformats.org/drawingml/2006/wordprocessingDrawing" xmlns:w10="urn:schemas-microsoft-com:office:word" xmlns:w="http://schemas.openxmlformats.org/wordprocessingml/2006/main" xmlns:w14="http://schemas.microsoft.com/office/word/2010/wordml" xmlns:w15="http://schemas.microsoft.com/office/word/2012/wordml" xmlns:w16cex="http://schemas.microsoft.com/office/word/2018/wordml/cex" xmlns:w16cid="http://schemas.microsoft.com/office/word/2016/wordml/cid" xmlns:w16="http://schemas.microsoft.com/office/word/2018/wordml" xmlns:w16du="http://schemas.microsoft.com/office/word/2023/wordml/word16du" xmlns:w16sdtdh="http://schemas.microsoft.com/office/word/2020/wordml/sdtdatahash" xmlns:w16sdtfl="http://schemas.microsoft.com/office/word/2024/wordml/sdtformatlock" xmlns:w16se="http://schemas.microsoft.com/office/word/2015/wordml/symex" xmlns:wpg="http://schemas.microsoft.com/office/word/2010/wordprocessingGroup" xmlns:wpi="http://schemas.microsoft.com/office/word/2010/wordprocessingInk" xmlns:wne="http://schemas.microsoft.com/office/word/2006/wordml" xmlns:wps="http://schemas.microsoft.com/office/word/2010/wordprocessingShape" mc:Ignorable="w14 w15 w16se w16cid w16 w16cex w16sdtdh w16sdtfl w16du wp14">
+  <w:abstractNum w:abstractNumId="0" w15:restartNumberingAfterBreak="0">
+    <w:nsid w:val="324118BB"/>
+    <w:multiLevelType w:val="multilevel"/>
+    <w:tmpl w:val="DDBC09D0"/>
+    <w:lvl w:ilvl="0">
+      <w:start w:val="1"/>
+      <w:numFmt w:val="decimal"/>
+      <w:lvlText w:val="%1."/>
+      <w:lvlJc w:val="left"/>
+      <w:pPr>
+        <w:tabs>
+          <w:tab w:val="num" w:pos="720"/>
+        </w:tabs>
+        <w:ind w:left="720" w:hanging="360"/>
+      </w:pPr>
+    </w:lvl>
+    <w:lvl w:ilvl="1" w:tentative="1">
+      <w:start w:val="1"/>
+      <w:numFmt w:val="decimal"/>
+      <w:lvlText w:val="%2."/>
+      <w:lvlJc w:val="left"/>
+      <w:pPr>
+        <w:tabs>
+          <w:tab w:val="num" w:pos="1440"/>
+        </w:tabs>
+        <w:ind w:left="1440" w:hanging="360"/>
+      </w:pPr>
+    </w:lvl>
+    <w:lvl w:ilvl="2" w:tentative="1">
+      <w:start w:val="1"/>
+      <w:numFmt w:val="decimal"/>
+      <w:lvlText w:val="%3."/>
+      <w:lvlJc w:val="left"/>
+      <w:pPr>
+        <w:tabs>
+          <w:tab w:val="num" w:pos="2160"/>
+        </w:tabs>
+        <w:ind w:left="2160" w:hanging="360"/>
+      </w:pPr>
+    </w:lvl>
+    <w:lvl w:ilvl="3" w:tentative="1">
+      <w:start w:val="1"/>
+      <w:numFmt w:val="decimal"/>
+      <w:lvlText w:val="%4."/>
+      <w:lvlJc w:val="left"/>
+      <w:pPr>
+        <w:tabs>
+          <w:tab w:val="num" w:pos="2880"/>
+        </w:tabs>
+        <w:ind w:left="2880" w:hanging="360"/>
+      </w:pPr>
+    </w:lvl>
+    <w:lvl w:ilvl="4" w:tentative="1">
+      <w:start w:val="1"/>
+      <w:numFmt w:val="decimal"/>
+      <w:lvlText w:val="%5."/>
+      <w:lvlJc w:val="left"/>
+      <w:pPr>
+        <w:tabs>
+          <w:tab w:val="num" w:pos="3600"/>
+        </w:tabs>
+        <w:ind w:left="3600" w:hanging="360"/>
+      </w:pPr>
+    </w:lvl>
+    <w:lvl w:ilvl="5" w:tentative="1">
+      <w:start w:val="1"/>
+      <w:numFmt w:val="decimal"/>
+      <w:lvlText w:val="%6."/>
+      <w:lvlJc w:val="left"/>
+      <w:pPr>
+        <w:tabs>
+          <w:tab w:val="num" w:pos="4320"/>
+        </w:tabs>
+        <w:ind w:left="4320" w:hanging="360"/>
+      </w:pPr>
+    </w:lvl>
+    <w:lvl w:ilvl="6" w:tentative="1">
+      <w:start w:val="1"/>
+      <w:numFmt w:val="decimal"/>
+      <w:lvlText w:val="%7."/>
+      <w:lvlJc w:val="left"/>
+      <w:pPr>
+        <w:tabs>
+          <w:tab w:val="num" w:pos="5040"/>
+        </w:tabs>
+        <w:ind w:left="5040" w:hanging="360"/>
+      </w:pPr>
+    </w:lvl>
+    <w:lvl w:ilvl="7" w:tentative="1">
+      <w:start w:val="1"/>
+      <w:numFmt w:val="decimal"/>
+      <w:lvlText w:val="%8."/>
+      <w:lvlJc w:val="left"/>
+      <w:pPr>
+        <w:tabs>
+          <w:tab w:val="num" w:pos="5760"/>
+        </w:tabs>
+        <w:ind w:left="5760" w:hanging="360"/>
+      </w:pPr>
+    </w:lvl>
+    <w:lvl w:ilvl="8" w:tentative="1">
+      <w:start w:val="1"/>
+      <w:numFmt w:val="decimal"/>
+      <w:lvlText w:val="%9."/>
+      <w:lvlJc w:val="left"/>
+      <w:pPr>
+        <w:tabs>
+          <w:tab w:val="num" w:pos="6480"/>
+        </w:tabs>
+        <w:ind w:left="6480" w:hanging="360"/>
+      </w:pPr>
+    </w:lvl>
+  </w:abstractNum>
+  <w:num w:numId="1" w16cid:durableId="1937471385">
+    <w:abstractNumId w:val="0"/>
+  </w:num>
+</w:numbering>
 </file>
 
 <file path=word/styles.xml><?xml version="1.0" encoding="utf-8"?>
@@ -11954,6 +12174,38 @@
       <w:shd w:val="clear" w:color="auto" w:fill="E1DFDD"/>
     </w:rPr>
   </w:style>
+  <w:style w:type="paragraph" w:customStyle="1" w:styleId="messagelistitem5126c">
+    <w:name w:val="messagelistitem__5126c"/>
+    <w:basedOn w:val="Normal"/>
+    <w:rsid w:val="00AD6334"/>
+    <w:pPr>
+      <w:spacing w:before="100" w:beforeAutospacing="1" w:after="100" w:afterAutospacing="1"/>
+    </w:pPr>
+    <w:rPr>
+      <w:rFonts w:ascii="Times New Roman" w:eastAsia="Times New Roman" w:hAnsi="Times New Roman" w:cs="Times New Roman"/>
+      <w:kern w:val="0"/>
+      <w:lang w:eastAsia="fr-FR"/>
+      <w14:ligatures w14:val="none"/>
+    </w:rPr>
+  </w:style>
+  <w:style w:type="character" w:styleId="CodeHTML">
+    <w:name w:val="HTML Code"/>
+    <w:basedOn w:val="Policepardfaut"/>
+    <w:uiPriority w:val="99"/>
+    <w:semiHidden/>
+    <w:unhideWhenUsed/>
+    <w:rsid w:val="00AD6334"/>
+    <w:rPr>
+      <w:rFonts w:ascii="Courier New" w:eastAsia="Times New Roman" w:hAnsi="Courier New" w:cs="Courier New"/>
+      <w:sz w:val="20"/>
+      <w:szCs w:val="20"/>
+    </w:rPr>
+  </w:style>
+  <w:style w:type="character" w:customStyle="1" w:styleId="latin12compacttimestampc19a55">
+    <w:name w:val="latin12compacttimestamp_c19a55"/>
+    <w:basedOn w:val="Policepardfaut"/>
+    <w:rsid w:val="00AD6334"/>
+  </w:style>
 </w:styles>
 </file>
 

</xml_diff>